<commit_message>
AI Tools Usage section at the end of both docs (slim, matches Passkey report style)
Re-shaped after looking at the author's IT Security 'General AI Tools
Usages' template (chapter 6 of the Passkeys report):
- Same matter-of-fact structure: Tools / Scope / Verification / Accountability
- Sits at the END of the document (not as a colophon at the front)
- Brief — 1 short table + 3 paragraphs in the technical doc; 2 paragraphs
  in the install guide
- Emphasises the author's accountability and the manual verification
  evidence (79 359 ML prediction rows, working install wizard, live
  KNIME workflows)
</commit_message>
<xml_diff>
--- a/docs/v2/out/DataCycle_Installation_Guide.docx
+++ b/docs/v2/out/DataCycle_Installation_Guide.docx
@@ -3202,6 +3202,192 @@
       </w:r>
     </w:p>
     <w:p>
+      <w:pPr>
+        <w:spacing w:after="80" w:before="200"/>
+        <w:jc w:val="center"/>
+      </w:pPr>
+      <w:r>
+        <w:drawing>
+          <wp:inline distT="0" distB="0" distL="0" distR="0">
+            <wp:extent cx="4572000" cy="2571750"/>
+            <wp:effectExtent t="0" r="0" b="0" l="0"/>
+            <wp:docPr id="1" name="{3BF76330-0286-4ECB-A023-B70E156A68FE}.png" descr="Figure 10 — 3BF76330-0286-4E…" title="Figure 10 — 3BF76330-0286-4E…"/>
+            <wp:cNvGraphicFramePr>
+              <a:graphicFrameLocks xmlns:a="http://schemas.openxmlformats.org/drawingml/2006/main" noChangeAspect="1"/>
+            </wp:cNvGraphicFramePr>
+            <a:graphic xmlns:a="http://schemas.openxmlformats.org/drawingml/2006/main">
+              <a:graphicData uri="http://schemas.openxmlformats.org/drawingml/2006/picture">
+                <pic:pic xmlns:pic="http://schemas.openxmlformats.org/drawingml/2006/picture">
+                  <pic:nvPicPr>
+                    <pic:cNvPr id="0" name="" descr=""/>
+                    <pic:cNvPicPr>
+                      <a:picLocks noChangeAspect="1" noChangeArrowheads="1"/>
+                    </pic:cNvPicPr>
+                  </pic:nvPicPr>
+                  <pic:blipFill>
+                    <a:blip r:embed="rId18" cstate="none"/>
+                    <a:srcRect/>
+                    <a:stretch>
+                      <a:fillRect/>
+                    </a:stretch>
+                  </pic:blipFill>
+                  <pic:spPr bwMode="auto">
+                    <a:xfrm>
+                      <a:off x="0" y="0"/>
+                      <a:ext cx="4572000" cy="2571750"/>
+                    </a:xfrm>
+                    <a:prstGeom prst="rect">
+                      <a:avLst/>
+                    </a:prstGeom>
+                  </pic:spPr>
+                </pic:pic>
+              </a:graphicData>
+            </a:graphic>
+          </wp:inline>
+        </w:drawing>
+      </w:r>
+    </w:p>
+    <w:p>
+      <w:pPr>
+        <w:spacing w:after="240"/>
+        <w:jc w:val="center"/>
+      </w:pPr>
+      <w:r>
+        <w:rPr>
+          <w:i/>
+          <w:iCs/>
+          <w:color w:val="6B7280"/>
+          <w:sz w:val="18"/>
+          <w:szCs w:val="18"/>
+        </w:rPr>
+        <w:t xml:space="preserve">Figure 10 — 3BF76330-0286-4E…</w:t>
+      </w:r>
+    </w:p>
+    <w:p>
+      <w:pPr>
+        <w:spacing w:after="80" w:before="200"/>
+        <w:jc w:val="center"/>
+      </w:pPr>
+      <w:r>
+        <w:drawing>
+          <wp:inline distT="0" distB="0" distL="0" distR="0">
+            <wp:extent cx="4572000" cy="2571750"/>
+            <wp:effectExtent t="0" r="0" b="0" l="0"/>
+            <wp:docPr id="1" name="{7F08C967-8476-4C14-9A54-411D89E7F5AE}.png" descr="Figure 11 — 7F08C967-8476-4C…" title="Figure 11 — 7F08C967-8476-4C…"/>
+            <wp:cNvGraphicFramePr>
+              <a:graphicFrameLocks xmlns:a="http://schemas.openxmlformats.org/drawingml/2006/main" noChangeAspect="1"/>
+            </wp:cNvGraphicFramePr>
+            <a:graphic xmlns:a="http://schemas.openxmlformats.org/drawingml/2006/main">
+              <a:graphicData uri="http://schemas.openxmlformats.org/drawingml/2006/picture">
+                <pic:pic xmlns:pic="http://schemas.openxmlformats.org/drawingml/2006/picture">
+                  <pic:nvPicPr>
+                    <pic:cNvPr id="0" name="" descr=""/>
+                    <pic:cNvPicPr>
+                      <a:picLocks noChangeAspect="1" noChangeArrowheads="1"/>
+                    </pic:cNvPicPr>
+                  </pic:nvPicPr>
+                  <pic:blipFill>
+                    <a:blip r:embed="rId19" cstate="none"/>
+                    <a:srcRect/>
+                    <a:stretch>
+                      <a:fillRect/>
+                    </a:stretch>
+                  </pic:blipFill>
+                  <pic:spPr bwMode="auto">
+                    <a:xfrm>
+                      <a:off x="0" y="0"/>
+                      <a:ext cx="4572000" cy="2571750"/>
+                    </a:xfrm>
+                    <a:prstGeom prst="rect">
+                      <a:avLst/>
+                    </a:prstGeom>
+                  </pic:spPr>
+                </pic:pic>
+              </a:graphicData>
+            </a:graphic>
+          </wp:inline>
+        </w:drawing>
+      </w:r>
+    </w:p>
+    <w:p>
+      <w:pPr>
+        <w:spacing w:after="240"/>
+        <w:jc w:val="center"/>
+      </w:pPr>
+      <w:r>
+        <w:rPr>
+          <w:i/>
+          <w:iCs/>
+          <w:color w:val="6B7280"/>
+          <w:sz w:val="18"/>
+          <w:szCs w:val="18"/>
+        </w:rPr>
+        <w:t xml:space="preserve">Figure 11 — 7F08C967-8476-4C…</w:t>
+      </w:r>
+    </w:p>
+    <w:p>
+      <w:pPr>
+        <w:spacing w:after="80" w:before="200"/>
+        <w:jc w:val="center"/>
+      </w:pPr>
+      <w:r>
+        <w:drawing>
+          <wp:inline distT="0" distB="0" distL="0" distR="0">
+            <wp:extent cx="4572000" cy="2571750"/>
+            <wp:effectExtent t="0" r="0" b="0" l="0"/>
+            <wp:docPr id="1" name="{5B8B5ACE-DBB9-4F24-9202-03B10683B467}.png" descr="Figure 12 — 5B8B5ACE-DBB9-4F…" title="Figure 12 — 5B8B5ACE-DBB9-4F…"/>
+            <wp:cNvGraphicFramePr>
+              <a:graphicFrameLocks xmlns:a="http://schemas.openxmlformats.org/drawingml/2006/main" noChangeAspect="1"/>
+            </wp:cNvGraphicFramePr>
+            <a:graphic xmlns:a="http://schemas.openxmlformats.org/drawingml/2006/main">
+              <a:graphicData uri="http://schemas.openxmlformats.org/drawingml/2006/picture">
+                <pic:pic xmlns:pic="http://schemas.openxmlformats.org/drawingml/2006/picture">
+                  <pic:nvPicPr>
+                    <pic:cNvPr id="0" name="" descr=""/>
+                    <pic:cNvPicPr>
+                      <a:picLocks noChangeAspect="1" noChangeArrowheads="1"/>
+                    </pic:cNvPicPr>
+                  </pic:nvPicPr>
+                  <pic:blipFill>
+                    <a:blip r:embed="rId20" cstate="none"/>
+                    <a:srcRect/>
+                    <a:stretch>
+                      <a:fillRect/>
+                    </a:stretch>
+                  </pic:blipFill>
+                  <pic:spPr bwMode="auto">
+                    <a:xfrm>
+                      <a:off x="0" y="0"/>
+                      <a:ext cx="4572000" cy="2571750"/>
+                    </a:xfrm>
+                    <a:prstGeom prst="rect">
+                      <a:avLst/>
+                    </a:prstGeom>
+                  </pic:spPr>
+                </pic:pic>
+              </a:graphicData>
+            </a:graphic>
+          </wp:inline>
+        </w:drawing>
+      </w:r>
+    </w:p>
+    <w:p>
+      <w:pPr>
+        <w:spacing w:after="240"/>
+        <w:jc w:val="center"/>
+      </w:pPr>
+      <w:r>
+        <w:rPr>
+          <w:i/>
+          <w:iCs/>
+          <w:color w:val="6B7280"/>
+          <w:sz w:val="18"/>
+          <w:szCs w:val="18"/>
+        </w:rPr>
+        <w:t xml:space="preserve">Figure 12 — 5B8B5ACE-DBB9-4F…</w:t>
+      </w:r>
+    </w:p>
+    <w:p>
       <w:r>
         <w:br w:type="page"/>
       </w:r>
@@ -3948,6 +4134,51 @@
           <w:szCs w:val="20"/>
         </w:rPr>
         <w:t xml:space="preserve">Remove-Item $HOME\knime-workspace -Recurse -Force</w:t>
+      </w:r>
+    </w:p>
+    <w:p>
+      <w:r>
+        <w:br w:type="page"/>
+      </w:r>
+    </w:p>
+    <w:p>
+      <w:pPr>
+        <w:pStyle w:val="Heading1"/>
+        <w:spacing w:after="240" w:before="480"/>
+      </w:pPr>
+      <w:r>
+        <w:rPr>
+          <w:b/>
+          <w:bCs/>
+          <w:color w:val="111827"/>
+          <w:sz w:val="36"/>
+          <w:szCs w:val="36"/>
+        </w:rPr>
+        <w:t xml:space="preserve">AI Tools Usage</w:t>
+      </w:r>
+    </w:p>
+    <w:p>
+      <w:pPr>
+        <w:spacing w:after="140"/>
+      </w:pPr>
+      <w:r>
+        <w:rPr>
+          <w:sz w:val="22"/>
+          <w:szCs w:val="22"/>
+        </w:rPr>
+        <w:t xml:space="preserve">Generative AI (Anthropic Claude Sonnet 4.6, via the Claude Code CLI) was used as a drafting aid for parts of this guide and for the installer template's Python code. No AI tool is considered an author. The installer flow, all credentials handling, and every screenshot in the appendix come from real installs performed by the author on the project VM.</w:t>
+      </w:r>
+    </w:p>
+    <w:p>
+      <w:pPr>
+        <w:spacing w:after="140"/>
+      </w:pPr>
+      <w:r>
+        <w:rPr>
+          <w:sz w:val="22"/>
+          <w:szCs w:val="22"/>
+        </w:rPr>
+        <w:t xml:space="preserve">The author retains full responsibility for the installer behavior and for the accuracy of this guide. All AI-assisted outputs were reviewed, corrected, and tested manually.</w:t>
       </w:r>
     </w:p>
     <w:p>

</xml_diff>

<commit_message>
AI Tools Usage: add comments + log messages to scope; switch to plural 'authors' (team)
Two refinements:

1. Scope of Assistance now includes 'Inline code comments' (docstrings
   and explanatory comments) and 'Log messages' (wording of progress
   lines, warnings, error messages emitted by the pipeline). These are
   real contributions worth disclosing alongside documentation drafts
   and Python boilerplate.

2. Switched 'the author' -> 'the authors' to match the team composition
   (Group 14: Dehlya Herbelin + Sacha Germanier + Johann Von Roten),
   consistent with the Passkey IT Security report's accountability
   wording.
</commit_message>
<xml_diff>
--- a/docs/v2/out/DataCycle_Installation_Guide.docx
+++ b/docs/v2/out/DataCycle_Installation_Guide.docx
@@ -4166,7 +4166,7 @@
           <w:sz w:val="22"/>
           <w:szCs w:val="22"/>
         </w:rPr>
-        <w:t xml:space="preserve">Generative AI (Anthropic Claude Sonnet 4.6, via the Claude Code CLI) was used as a drafting aid for parts of this guide and for the installer template's Python code. No AI tool is considered an author. The installer flow, all credentials handling, and every screenshot in the appendix come from real installs performed by the author on the project VM.</w:t>
+        <w:t xml:space="preserve">Generative AI (Anthropic Claude Sonnet 4.6, via the Claude Code CLI) was used as a drafting aid for parts of this guide, for the installer template's Python code, and for the wording of inline code comments and log messages emitted by the pipeline. No AI tool is considered an author. The installer flow, all credentials handling, and every screenshot in the appendix come from real installs performed by the authors on the project VM.</w:t>
       </w:r>
     </w:p>
     <w:p>
@@ -4178,7 +4178,7 @@
           <w:sz w:val="22"/>
           <w:szCs w:val="22"/>
         </w:rPr>
-        <w:t xml:space="preserve">The author retains full responsibility for the installer behavior and for the accuracy of this guide. All AI-assisted outputs were reviewed, corrected, and tested manually.</w:t>
+        <w:t xml:space="preserve">The authors retain full responsibility for the installer behavior and for the accuracy of this guide. All AI-assisted outputs were reviewed, corrected, and tested manually.</w:t>
       </w:r>
     </w:p>
     <w:p>

</xml_diff>